<commit_message>
Modificación de la descarga por medio de Releases
</commit_message>
<xml_diff>
--- a/manual-de-descarga-repositorio-github.docx
+++ b/manual-de-descarga-repositorio-github.docx
@@ -350,15 +350,7 @@
           <w:bCs/>
           <w:noProof/>
         </w:rPr>
-        <w:t>Acceder al sitio web</w:t>
-      </w:r>
-      <w:r>
-        <w:rPr>
-          <w:b/>
-          <w:bCs/>
-          <w:noProof/>
-        </w:rPr>
-        <w:t>:</w:t>
+        <w:t>Acceder al sitio web:</w:t>
       </w:r>
       <w:r>
         <w:t xml:space="preserve"> </w:t>
@@ -381,7 +373,30 @@
         </w:r>
       </w:hyperlink>
       <w:r>
-        <w:t xml:space="preserve"> y presione el botón “Sign Up”</w:t>
+        <w:t xml:space="preserve"> y presione el botón </w:t>
+      </w:r>
+      <w:r>
+        <w:rPr>
+          <w:i/>
+          <w:iCs/>
+        </w:rPr>
+        <w:t>“</w:t>
+      </w:r>
+      <w:proofErr w:type="spellStart"/>
+      <w:r>
+        <w:rPr>
+          <w:i/>
+          <w:iCs/>
+        </w:rPr>
+        <w:t>Sign</w:t>
+      </w:r>
+      <w:proofErr w:type="spellEnd"/>
+      <w:r>
+        <w:rPr>
+          <w:i/>
+          <w:iCs/>
+        </w:rPr>
+        <w:t xml:space="preserve"> Up”</w:t>
       </w:r>
       <w:r>
         <w:rPr>
@@ -413,7 +428,7 @@
           <w:iCs/>
           <w:noProof/>
         </w:rPr>
-        <w:t>“Imagen 1: botón Sign Up.”</w:t>
+        <w:t>Imagen 1: botón Sign Up.</w:t>
       </w:r>
     </w:p>
     <w:p>
@@ -509,7 +524,13 @@
           <w:bCs/>
           <w:noProof/>
         </w:rPr>
-        <w:t>Completar el formulario de registro</w:t>
+        <w:t xml:space="preserve">Completar el formulario de registro: </w:t>
+      </w:r>
+      <w:r>
+        <w:rPr>
+          <w:noProof/>
+        </w:rPr>
+        <w:t xml:space="preserve">Complete el formulario ingresando su información personal. </w:t>
       </w:r>
       <w:r>
         <w:rPr>
@@ -517,20 +538,6 @@
           <w:bCs/>
           <w:noProof/>
         </w:rPr>
-        <w:t xml:space="preserve">: </w:t>
-      </w:r>
-      <w:r>
-        <w:rPr>
-          <w:noProof/>
-        </w:rPr>
-        <w:t xml:space="preserve">Complete el formulario ingresando su información personal. </w:t>
-      </w:r>
-      <w:r>
-        <w:rPr>
-          <w:b/>
-          <w:bCs/>
-          <w:noProof/>
-        </w:rPr>
         <w:t>En la casilla de correo electrónico debe utilizar su cuenta institucional Red Salud</w:t>
       </w:r>
       <w:r>
@@ -587,31 +594,7 @@
           <w:iCs/>
           <w:noProof/>
         </w:rPr>
-        <w:t>“</w:t>
-      </w:r>
-      <w:r>
-        <w:rPr>
-          <w:i/>
-          <w:iCs/>
-          <w:noProof/>
-        </w:rPr>
-        <w:t>Imagen 2: Formulario de registro</w:t>
-      </w:r>
-      <w:r>
-        <w:rPr>
-          <w:i/>
-          <w:iCs/>
-          <w:noProof/>
-        </w:rPr>
-        <w:t>”</w:t>
-      </w:r>
-      <w:r>
-        <w:rPr>
-          <w:i/>
-          <w:iCs/>
-          <w:noProof/>
-        </w:rPr>
-        <w:t xml:space="preserve"> </w:t>
+        <w:t xml:space="preserve">Imagen 2: Formulario de registro </w:t>
       </w:r>
       <w:r>
         <w:rPr>
@@ -687,16 +670,7 @@
           <w:szCs w:val="28"/>
           <w:vertAlign w:val="superscript"/>
         </w:rPr>
-        <w:t>Imagen 2: Formulario de registro</w:t>
-      </w:r>
-      <w:r>
-        <w:rPr>
-          <w:noProof/>
-          <w:sz w:val="28"/>
-          <w:szCs w:val="28"/>
-          <w:vertAlign w:val="superscript"/>
-        </w:rPr>
-        <w:t>.</w:t>
+        <w:t>Imagen 2: Formulario de registro.</w:t>
       </w:r>
     </w:p>
     <w:p>
@@ -787,7 +761,7 @@
           <w:iCs/>
           <w:noProof/>
         </w:rPr>
-        <w:t>“Imagen 3: confirmación de cuenta de correo electronico”.</w:t>
+        <w:t>Imagen 3: confirmación de cuenta de correo electronico.</w:t>
       </w:r>
     </w:p>
     <w:p>
@@ -924,8 +898,6 @@
     <w:p>
       <w:pPr>
         <w:rPr>
-          <w:i/>
-          <w:iCs/>
           <w:noProof/>
         </w:rPr>
       </w:pPr>
@@ -969,7 +941,7 @@
           <w:iCs/>
           <w:noProof/>
         </w:rPr>
-        <w:t>“Imagen 4: ingreso a la cuenta”</w:t>
+        <w:t>Imagen 4: ingreso a la cuenta</w:t>
       </w:r>
       <w:r>
         <w:rPr>
@@ -979,13 +951,6 @@
         </w:rPr>
         <w:t>.</w:t>
       </w:r>
-    </w:p>
-    <w:p>
-      <w:pPr>
-        <w:rPr>
-          <w:noProof/>
-        </w:rPr>
-      </w:pPr>
     </w:p>
     <w:p>
       <w:pPr>
@@ -1061,13 +1026,23 @@
     <w:p>
       <w:pPr>
         <w:rPr>
+          <w:noProof/>
+          <w:sz w:val="28"/>
+          <w:szCs w:val="28"/>
+          <w:vertAlign w:val="superscript"/>
+        </w:rPr>
+      </w:pPr>
+      <w:r>
+        <w:rPr>
           <w:b/>
           <w:bCs/>
           <w:noProof/>
           <w:sz w:val="28"/>
           <w:szCs w:val="28"/>
         </w:rPr>
-      </w:pPr>
+        <w:lastRenderedPageBreak/>
+        <w:t xml:space="preserve">4.- </w:t>
+      </w:r>
       <w:r>
         <w:rPr>
           <w:b/>
@@ -1076,14 +1051,516 @@
           <w:sz w:val="28"/>
           <w:szCs w:val="28"/>
         </w:rPr>
-        <w:lastRenderedPageBreak/>
-        <w:t xml:space="preserve">4.- </w:t>
-      </w:r>
-      <w:r>
+        <w:t>Aceptar invitación a los repositorios GitHub</w:t>
+      </w:r>
+    </w:p>
+    <w:p>
+      <w:pPr>
+        <w:rPr>
+          <w:noProof/>
+        </w:rPr>
+      </w:pPr>
+      <w:r>
+        <w:rPr>
+          <w:noProof/>
+        </w:rPr>
+        <w:t xml:space="preserve">Después de crear su cuenta en GitHub, revise su correo electrónico corporativo </w:t>
+      </w:r>
+      <w:r>
+        <w:rPr>
+          <w:noProof/>
+        </w:rPr>
+        <w:t xml:space="preserve">ingresado en el registro </w:t>
+      </w:r>
+      <w:r>
+        <w:rPr>
+          <w:noProof/>
+        </w:rPr>
+        <w:t>y localice el mensaje de invitación para unirse a los repositorios de la organización</w:t>
+      </w:r>
+      <w:r>
+        <w:rPr>
+          <w:i/>
+          <w:iCs/>
+          <w:noProof/>
+        </w:rPr>
+        <w:t xml:space="preserve"> </w:t>
+      </w:r>
+      <w:r>
+        <w:rPr>
+          <w:i/>
+          <w:iCs/>
+          <w:noProof/>
+        </w:rPr>
+        <w:t>“</w:t>
+      </w:r>
+      <w:r>
+        <w:rPr>
+          <w:i/>
+          <w:iCs/>
+          <w:noProof/>
+        </w:rPr>
+        <w:t>repo-ssmc</w:t>
+      </w:r>
+      <w:r>
+        <w:rPr>
+          <w:i/>
+          <w:iCs/>
+          <w:noProof/>
+        </w:rPr>
+        <w:t>”</w:t>
+      </w:r>
+      <w:r>
+        <w:rPr>
+          <w:noProof/>
+        </w:rPr>
+        <w:t xml:space="preserve">. </w:t>
+      </w:r>
+      <w:r>
+        <w:rPr>
+          <w:noProof/>
+        </w:rPr>
+        <w:t xml:space="preserve">Abra el correo y haga clic en </w:t>
+      </w:r>
+      <w:r>
+        <w:rPr>
+          <w:i/>
+          <w:iCs/>
+          <w:noProof/>
+        </w:rPr>
+        <w:t>“Join @repo-ssmc</w:t>
+      </w:r>
+      <w:r>
+        <w:rPr>
+          <w:i/>
+          <w:iCs/>
+          <w:noProof/>
+        </w:rPr>
+        <w:t>”</w:t>
+      </w:r>
+      <w:r>
+        <w:rPr>
+          <w:i/>
+          <w:iCs/>
+          <w:noProof/>
+        </w:rPr>
+        <w:t xml:space="preserve"> </w:t>
+      </w:r>
+      <w:r>
+        <w:rPr>
+          <w:noProof/>
+        </w:rPr>
+        <w:t xml:space="preserve">tal como se muestra en la </w:t>
+      </w:r>
+      <w:r>
+        <w:rPr>
+          <w:i/>
+          <w:iCs/>
+          <w:noProof/>
+        </w:rPr>
+        <w:t>Imagen 5: Invitación al repositorio GitHub.</w:t>
+      </w:r>
+    </w:p>
+    <w:p>
+      <w:pPr>
+        <w:jc w:val="center"/>
+        <w:rPr>
+          <w:i/>
+          <w:iCs/>
+          <w:noProof/>
+          <w:sz w:val="32"/>
+          <w:szCs w:val="32"/>
+          <w:vertAlign w:val="superscript"/>
+        </w:rPr>
+      </w:pPr>
+      <w:r>
+        <w:rPr>
+          <w:i/>
+          <w:iCs/>
+          <w:noProof/>
+          <w:sz w:val="32"/>
+          <w:szCs w:val="32"/>
+          <w:vertAlign w:val="superscript"/>
+        </w:rPr>
+        <w:drawing>
+          <wp:inline distT="0" distB="0" distL="0" distR="0" wp14:anchorId="45F3D42D" wp14:editId="5F88A023">
+            <wp:extent cx="3981450" cy="5798228"/>
+            <wp:effectExtent l="19050" t="19050" r="19050" b="12065"/>
+            <wp:docPr id="1588527001" name="Imagen 5"/>
+            <wp:cNvGraphicFramePr>
+              <a:graphicFrameLocks xmlns:a="http://schemas.openxmlformats.org/drawingml/2006/main" noChangeAspect="1"/>
+            </wp:cNvGraphicFramePr>
+            <a:graphic xmlns:a="http://schemas.openxmlformats.org/drawingml/2006/main">
+              <a:graphicData uri="http://schemas.openxmlformats.org/drawingml/2006/picture">
+                <pic:pic xmlns:pic="http://schemas.openxmlformats.org/drawingml/2006/picture">
+                  <pic:nvPicPr>
+                    <pic:cNvPr id="1588527001" name="Imagen 1588527001"/>
+                    <pic:cNvPicPr/>
+                  </pic:nvPicPr>
+                  <pic:blipFill>
+                    <a:blip r:embed="rId12">
+                      <a:extLst>
+                        <a:ext uri="{28A0092B-C50C-407E-A947-70E740481C1C}">
+                          <a14:useLocalDpi xmlns:a14="http://schemas.microsoft.com/office/drawing/2010/main" val="0"/>
+                        </a:ext>
+                      </a:extLst>
+                    </a:blip>
+                    <a:stretch>
+                      <a:fillRect/>
+                    </a:stretch>
+                  </pic:blipFill>
+                  <pic:spPr>
+                    <a:xfrm>
+                      <a:off x="0" y="0"/>
+                      <a:ext cx="3982823" cy="5800228"/>
+                    </a:xfrm>
+                    <a:prstGeom prst="rect">
+                      <a:avLst/>
+                    </a:prstGeom>
+                    <a:ln w="6350">
+                      <a:solidFill>
+                        <a:schemeClr val="tx1"/>
+                      </a:solidFill>
+                    </a:ln>
+                  </pic:spPr>
+                </pic:pic>
+              </a:graphicData>
+            </a:graphic>
+          </wp:inline>
+        </w:drawing>
+      </w:r>
+    </w:p>
+    <w:p>
+      <w:pPr>
+        <w:jc w:val="center"/>
         <w:rPr>
           <w:b/>
           <w:bCs/>
           <w:noProof/>
+          <w:sz w:val="32"/>
+          <w:szCs w:val="32"/>
+          <w:vertAlign w:val="superscript"/>
+        </w:rPr>
+      </w:pPr>
+      <w:r>
+        <w:rPr>
+          <w:i/>
+          <w:iCs/>
+          <w:noProof/>
+          <w:sz w:val="32"/>
+          <w:szCs w:val="32"/>
+          <w:vertAlign w:val="superscript"/>
+        </w:rPr>
+        <w:t>Imagen 5: Invitación al repositorio GitHu</w:t>
+      </w:r>
+      <w:r>
+        <w:rPr>
+          <w:i/>
+          <w:iCs/>
+          <w:noProof/>
+          <w:sz w:val="32"/>
+          <w:szCs w:val="32"/>
+          <w:vertAlign w:val="superscript"/>
+        </w:rPr>
+        <w:t>b.</w:t>
+      </w:r>
+    </w:p>
+    <w:p>
+      <w:pPr>
+        <w:rPr>
+          <w:b/>
+          <w:bCs/>
+          <w:noProof/>
+          <w:sz w:val="32"/>
+          <w:szCs w:val="32"/>
+          <w:vertAlign w:val="superscript"/>
+        </w:rPr>
+      </w:pPr>
+      <w:r>
+        <w:rPr>
+          <w:b/>
+          <w:bCs/>
+          <w:noProof/>
+          <w:sz w:val="28"/>
+          <w:szCs w:val="28"/>
+        </w:rPr>
+        <w:lastRenderedPageBreak/>
+        <w:t>5</w:t>
+      </w:r>
+      <w:r>
+        <w:rPr>
+          <w:b/>
+          <w:bCs/>
+          <w:noProof/>
+          <w:sz w:val="28"/>
+          <w:szCs w:val="28"/>
+        </w:rPr>
+        <w:t xml:space="preserve">.- </w:t>
+      </w:r>
+      <w:r>
+        <w:rPr>
+          <w:b/>
+          <w:bCs/>
+          <w:noProof/>
+          <w:sz w:val="28"/>
+          <w:szCs w:val="28"/>
+        </w:rPr>
+        <w:t>Confirmar invitación a los repositorios</w:t>
+      </w:r>
+    </w:p>
+    <w:p>
+      <w:pPr>
+        <w:rPr>
+          <w:noProof/>
+        </w:rPr>
+      </w:pPr>
+      <w:r>
+        <w:rPr>
+          <w:noProof/>
+        </w:rPr>
+        <w:t>Una vez dentro de su cuenta de GitHub, confirme la invitación al repositorio de la organización.</w:t>
+      </w:r>
+      <w:r>
+        <w:rPr>
+          <w:noProof/>
+        </w:rPr>
+        <w:t xml:space="preserve"> </w:t>
+      </w:r>
+      <w:r>
+        <w:rPr>
+          <w:noProof/>
+        </w:rPr>
+        <w:t xml:space="preserve">Para ello, presione </w:t>
+      </w:r>
+      <w:r>
+        <w:rPr>
+          <w:i/>
+          <w:iCs/>
+          <w:noProof/>
+        </w:rPr>
+        <w:t xml:space="preserve">“Join repo-ssmc” </w:t>
+      </w:r>
+      <w:r>
+        <w:rPr>
+          <w:noProof/>
+        </w:rPr>
+        <w:t xml:space="preserve">como se muestra en la </w:t>
+      </w:r>
+      <w:r>
+        <w:rPr>
+          <w:i/>
+          <w:iCs/>
+          <w:noProof/>
+        </w:rPr>
+        <w:t>Imagen 6: Confirmación de invitación</w:t>
+      </w:r>
+      <w:r>
+        <w:rPr>
+          <w:noProof/>
+        </w:rPr>
+        <w:t>.</w:t>
+      </w:r>
+    </w:p>
+    <w:p>
+      <w:pPr>
+        <w:rPr>
+          <w:b/>
+          <w:bCs/>
+          <w:noProof/>
+          <w:sz w:val="28"/>
+          <w:szCs w:val="28"/>
+        </w:rPr>
+      </w:pPr>
+      <w:r>
+        <w:rPr>
+          <w:b/>
+          <w:bCs/>
+          <w:noProof/>
+          <w:sz w:val="28"/>
+          <w:szCs w:val="28"/>
+        </w:rPr>
+        <w:drawing>
+          <wp:inline distT="0" distB="0" distL="0" distR="0" wp14:anchorId="06B8B179" wp14:editId="699427ED">
+            <wp:extent cx="5612130" cy="4932680"/>
+            <wp:effectExtent l="19050" t="19050" r="26670" b="20320"/>
+            <wp:docPr id="1894007185" name="Imagen 6"/>
+            <wp:cNvGraphicFramePr>
+              <a:graphicFrameLocks xmlns:a="http://schemas.openxmlformats.org/drawingml/2006/main" noChangeAspect="1"/>
+            </wp:cNvGraphicFramePr>
+            <a:graphic xmlns:a="http://schemas.openxmlformats.org/drawingml/2006/main">
+              <a:graphicData uri="http://schemas.openxmlformats.org/drawingml/2006/picture">
+                <pic:pic xmlns:pic="http://schemas.openxmlformats.org/drawingml/2006/picture">
+                  <pic:nvPicPr>
+                    <pic:cNvPr id="1894007185" name="Imagen 1894007185"/>
+                    <pic:cNvPicPr/>
+                  </pic:nvPicPr>
+                  <pic:blipFill>
+                    <a:blip r:embed="rId13">
+                      <a:extLst>
+                        <a:ext uri="{28A0092B-C50C-407E-A947-70E740481C1C}">
+                          <a14:useLocalDpi xmlns:a14="http://schemas.microsoft.com/office/drawing/2010/main" val="0"/>
+                        </a:ext>
+                      </a:extLst>
+                    </a:blip>
+                    <a:stretch>
+                      <a:fillRect/>
+                    </a:stretch>
+                  </pic:blipFill>
+                  <pic:spPr>
+                    <a:xfrm>
+                      <a:off x="0" y="0"/>
+                      <a:ext cx="5612130" cy="4932680"/>
+                    </a:xfrm>
+                    <a:prstGeom prst="rect">
+                      <a:avLst/>
+                    </a:prstGeom>
+                    <a:ln w="6350">
+                      <a:solidFill>
+                        <a:schemeClr val="tx1"/>
+                      </a:solidFill>
+                    </a:ln>
+                  </pic:spPr>
+                </pic:pic>
+              </a:graphicData>
+            </a:graphic>
+          </wp:inline>
+        </w:drawing>
+      </w:r>
+    </w:p>
+    <w:p>
+      <w:pPr>
+        <w:jc w:val="center"/>
+        <w:rPr>
+          <w:b/>
+          <w:bCs/>
+          <w:noProof/>
+          <w:sz w:val="32"/>
+          <w:szCs w:val="32"/>
+          <w:vertAlign w:val="superscript"/>
+        </w:rPr>
+      </w:pPr>
+      <w:r>
+        <w:rPr>
+          <w:i/>
+          <w:iCs/>
+          <w:noProof/>
+          <w:sz w:val="32"/>
+          <w:szCs w:val="32"/>
+          <w:vertAlign w:val="superscript"/>
+        </w:rPr>
+        <w:t xml:space="preserve">Imagen </w:t>
+      </w:r>
+      <w:r>
+        <w:rPr>
+          <w:i/>
+          <w:iCs/>
+          <w:noProof/>
+          <w:sz w:val="32"/>
+          <w:szCs w:val="32"/>
+          <w:vertAlign w:val="superscript"/>
+        </w:rPr>
+        <w:t>6:</w:t>
+      </w:r>
+      <w:r>
+        <w:rPr>
+          <w:i/>
+          <w:iCs/>
+          <w:noProof/>
+        </w:rPr>
+        <w:t xml:space="preserve"> </w:t>
+      </w:r>
+      <w:r>
+        <w:rPr>
+          <w:i/>
+          <w:iCs/>
+          <w:noProof/>
+          <w:sz w:val="32"/>
+          <w:szCs w:val="32"/>
+          <w:vertAlign w:val="superscript"/>
+        </w:rPr>
+        <w:t>Confirmación invitación</w:t>
+      </w:r>
+      <w:r>
+        <w:rPr>
+          <w:i/>
+          <w:iCs/>
+          <w:noProof/>
+          <w:sz w:val="32"/>
+          <w:szCs w:val="32"/>
+          <w:vertAlign w:val="superscript"/>
+        </w:rPr>
+        <w:t>.</w:t>
+      </w:r>
+    </w:p>
+    <w:p>
+      <w:pPr>
+        <w:rPr>
+          <w:b/>
+          <w:bCs/>
+          <w:noProof/>
+          <w:sz w:val="28"/>
+          <w:szCs w:val="28"/>
+        </w:rPr>
+      </w:pPr>
+    </w:p>
+    <w:p>
+      <w:pPr>
+        <w:rPr>
+          <w:b/>
+          <w:bCs/>
+          <w:noProof/>
+          <w:sz w:val="28"/>
+          <w:szCs w:val="28"/>
+        </w:rPr>
+      </w:pPr>
+    </w:p>
+    <w:p>
+      <w:pPr>
+        <w:rPr>
+          <w:b/>
+          <w:bCs/>
+          <w:noProof/>
+          <w:sz w:val="28"/>
+          <w:szCs w:val="28"/>
+        </w:rPr>
+      </w:pPr>
+    </w:p>
+    <w:p>
+      <w:pPr>
+        <w:rPr>
+          <w:b/>
+          <w:bCs/>
+          <w:noProof/>
+          <w:sz w:val="28"/>
+          <w:szCs w:val="28"/>
+        </w:rPr>
+      </w:pPr>
+      <w:r>
+        <w:rPr>
+          <w:b/>
+          <w:bCs/>
+          <w:noProof/>
+          <w:sz w:val="28"/>
+          <w:szCs w:val="28"/>
+        </w:rPr>
+        <w:lastRenderedPageBreak/>
+        <w:t>6</w:t>
+      </w:r>
+      <w:r>
+        <w:rPr>
+          <w:b/>
+          <w:bCs/>
+          <w:noProof/>
+          <w:sz w:val="28"/>
+          <w:szCs w:val="28"/>
+        </w:rPr>
+        <w:t xml:space="preserve">.- </w:t>
+      </w:r>
+      <w:r>
+        <w:rPr>
+          <w:b/>
+          <w:bCs/>
+          <w:noProof/>
           <w:sz w:val="28"/>
           <w:szCs w:val="28"/>
         </w:rPr>
@@ -1102,7 +1579,15 @@
         <w:rPr>
           <w:noProof/>
         </w:rPr>
-        <w:t xml:space="preserve">Una vez que haya iniciado sesión, en la pantalla principal encontrará acceso a la organización </w:t>
+        <w:t>Una vez iniciada la sesión en su cuenta de GitHub, en la pantalla principal encontrará acceso a la organización</w:t>
+      </w:r>
+      <w:r>
+        <w:rPr>
+          <w:i/>
+          <w:iCs/>
+          <w:noProof/>
+        </w:rPr>
+        <w:t xml:space="preserve"> </w:t>
       </w:r>
       <w:r>
         <w:rPr>
@@ -1132,39 +1617,29 @@
           <w:iCs/>
           <w:noProof/>
         </w:rPr>
-        <w:t>“View organization”</w:t>
-      </w:r>
-      <w:r>
-        <w:rPr>
-          <w:i/>
-          <w:iCs/>
-          <w:noProof/>
-        </w:rPr>
-        <w:t>.</w:t>
-      </w:r>
-      <w:r>
-        <w:rPr>
-          <w:i/>
-          <w:iCs/>
-          <w:noProof/>
-        </w:rPr>
-        <w:t xml:space="preserve"> “</w:t>
-      </w:r>
-      <w:r>
-        <w:rPr>
-          <w:i/>
-          <w:iCs/>
-          <w:noProof/>
-        </w:rPr>
-        <w:t>Imagen 5: página de inicio de su cuenta GitHub</w:t>
-      </w:r>
-      <w:r>
-        <w:rPr>
-          <w:i/>
-          <w:iCs/>
-          <w:noProof/>
-        </w:rPr>
-        <w:t>”</w:t>
+        <w:t>“View organization</w:t>
+      </w:r>
+      <w:r>
+        <w:rPr>
+          <w:i/>
+          <w:iCs/>
+          <w:noProof/>
+        </w:rPr>
+        <w:t xml:space="preserve">” </w:t>
+      </w:r>
+      <w:r>
+        <w:rPr>
+          <w:noProof/>
+        </w:rPr>
+        <w:t>como se muestra en la</w:t>
+      </w:r>
+      <w:r>
+        <w:rPr>
+          <w:i/>
+          <w:iCs/>
+          <w:noProof/>
+        </w:rPr>
+        <w:t xml:space="preserve"> Imagen 7: Página de inicio de su cuenta GitHub.</w:t>
       </w:r>
     </w:p>
     <w:p>
@@ -1197,7 +1672,7 @@
                     <pic:cNvPicPr/>
                   </pic:nvPicPr>
                   <pic:blipFill>
-                    <a:blip r:embed="rId12" cstate="print">
+                    <a:blip r:embed="rId14" cstate="print">
                       <a:extLst>
                         <a:ext uri="{28A0092B-C50C-407E-A947-70E740481C1C}">
                           <a14:useLocalDpi xmlns:a14="http://schemas.microsoft.com/office/drawing/2010/main" val="0"/>
@@ -1235,7 +1710,25 @@
           <w:szCs w:val="28"/>
           <w:vertAlign w:val="superscript"/>
         </w:rPr>
-        <w:t xml:space="preserve">Imagen 5: página de inicio de </w:t>
+        <w:t xml:space="preserve">Imagen </w:t>
+      </w:r>
+      <w:r>
+        <w:rPr>
+          <w:noProof/>
+          <w:sz w:val="28"/>
+          <w:szCs w:val="28"/>
+          <w:vertAlign w:val="superscript"/>
+        </w:rPr>
+        <w:t>7</w:t>
+      </w:r>
+      <w:r>
+        <w:rPr>
+          <w:noProof/>
+          <w:sz w:val="28"/>
+          <w:szCs w:val="28"/>
+          <w:vertAlign w:val="superscript"/>
+        </w:rPr>
+        <w:t xml:space="preserve">: página de inicio de </w:t>
       </w:r>
       <w:r>
         <w:rPr>
@@ -1283,7 +1776,7 @@
           <w:sz w:val="28"/>
           <w:szCs w:val="28"/>
         </w:rPr>
-        <w:t xml:space="preserve">5.- </w:t>
+        <w:t>7</w:t>
       </w:r>
       <w:r>
         <w:rPr>
@@ -1293,6 +1786,16 @@
           <w:sz w:val="28"/>
           <w:szCs w:val="28"/>
         </w:rPr>
+        <w:t xml:space="preserve">.- </w:t>
+      </w:r>
+      <w:r>
+        <w:rPr>
+          <w:b/>
+          <w:bCs/>
+          <w:noProof/>
+          <w:sz w:val="28"/>
+          <w:szCs w:val="28"/>
+        </w:rPr>
         <w:t>Visualizar repositorios de la organización</w:t>
       </w:r>
     </w:p>
@@ -1334,7 +1837,19 @@
         <w:rPr>
           <w:noProof/>
         </w:rPr>
-        <w:t>encontrará tres repositorios disponibles:</w:t>
+        <w:t xml:space="preserve">encontrará </w:t>
+      </w:r>
+      <w:r>
+        <w:rPr>
+          <w:noProof/>
+        </w:rPr>
+        <w:t>cuatro</w:t>
+      </w:r>
+      <w:r>
+        <w:rPr>
+          <w:noProof/>
+        </w:rPr>
+        <w:t xml:space="preserve"> repositorios disponibles:</w:t>
       </w:r>
     </w:p>
     <w:p>
@@ -1388,19 +1903,49 @@
         <w:rPr>
           <w:noProof/>
         </w:rPr>
-        <w:t xml:space="preserve">genera-icon: Código fuente proyecto para generar un </w:t>
-      </w:r>
-      <w:r>
-        <w:rPr>
-          <w:noProof/>
-        </w:rPr>
-        <w:t>icono para el ejecutable.</w:t>
-      </w:r>
-      <w:r>
-        <w:rPr>
-          <w:noProof/>
-        </w:rPr>
-        <w:t xml:space="preserve"> </w:t>
+        <w:t>documentos: Manuales de tecnologías y aplicativos.</w:t>
+      </w:r>
+    </w:p>
+    <w:p>
+      <w:pPr>
+        <w:pStyle w:val="Prrafodelista"/>
+        <w:numPr>
+          <w:ilvl w:val="0"/>
+          <w:numId w:val="1"/>
+        </w:numPr>
+        <w:rPr>
+          <w:noProof/>
+        </w:rPr>
+      </w:pPr>
+      <w:r>
+        <w:rPr>
+          <w:noProof/>
+        </w:rPr>
+        <w:t xml:space="preserve">genera-icon: Código fuente </w:t>
+      </w:r>
+      <w:r>
+        <w:rPr>
+          <w:noProof/>
+        </w:rPr>
+        <w:t xml:space="preserve">del </w:t>
+      </w:r>
+      <w:r>
+        <w:rPr>
+          <w:noProof/>
+        </w:rPr>
+        <w:t xml:space="preserve">proyecto </w:t>
+      </w:r>
+      <w:r>
+        <w:rPr>
+          <w:noProof/>
+        </w:rPr>
+        <w:t>que</w:t>
+      </w:r>
+      <w:r>
+        <w:rPr>
+          <w:noProof/>
+        </w:rPr>
+        <w:t xml:space="preserve"> genera un icono para el ejecutable.</w:t>
       </w:r>
     </w:p>
     <w:p>
@@ -1419,6 +1964,12 @@
         <w:rPr>
           <w:noProof/>
         </w:rPr>
+        <w:t xml:space="preserve"> y versionado</w:t>
+      </w:r>
+      <w:r>
+        <w:rPr>
+          <w:noProof/>
+        </w:rPr>
         <w:t xml:space="preserve">, </w:t>
       </w:r>
       <w:r>
@@ -1427,37 +1978,37 @@
           <w:iCs/>
           <w:noProof/>
         </w:rPr>
-        <w:t>“</w:t>
-      </w:r>
-      <w:r>
-        <w:rPr>
-          <w:i/>
-          <w:iCs/>
-          <w:noProof/>
-        </w:rPr>
-        <w:t>cambios-rem-app</w:t>
-      </w:r>
-      <w:r>
-        <w:rPr>
-          <w:i/>
-          <w:iCs/>
-          <w:noProof/>
-        </w:rPr>
-        <w:t>”</w:t>
-      </w:r>
-      <w:r>
-        <w:rPr>
-          <w:noProof/>
-        </w:rPr>
-        <w:t>.</w:t>
-      </w:r>
-      <w:r>
-        <w:rPr>
-          <w:i/>
-          <w:iCs/>
-          <w:noProof/>
-        </w:rPr>
-        <w:t xml:space="preserve"> “Imagen 6: repositorio </w:t>
+        <w:t>“cambios-rem-app”</w:t>
+      </w:r>
+      <w:r>
+        <w:rPr>
+          <w:noProof/>
+        </w:rPr>
+        <w:t xml:space="preserve"> como muesta la </w:t>
+      </w:r>
+      <w:r>
+        <w:rPr>
+          <w:i/>
+          <w:iCs/>
+          <w:noProof/>
+        </w:rPr>
+        <w:t xml:space="preserve">Imagen </w:t>
+      </w:r>
+      <w:r>
+        <w:rPr>
+          <w:i/>
+          <w:iCs/>
+          <w:noProof/>
+        </w:rPr>
+        <w:t>8</w:t>
+      </w:r>
+      <w:r>
+        <w:rPr>
+          <w:i/>
+          <w:iCs/>
+          <w:noProof/>
+        </w:rPr>
+        <w:t xml:space="preserve">: repositorio </w:t>
       </w:r>
       <w:r>
         <w:rPr>
@@ -1467,28 +2018,6 @@
         </w:rPr>
         <w:t>de la organización repo-ssmc.</w:t>
       </w:r>
-      <w:r>
-        <w:rPr>
-          <w:i/>
-          <w:iCs/>
-          <w:noProof/>
-        </w:rPr>
-        <w:t>”</w:t>
-      </w:r>
-      <w:r>
-        <w:rPr>
-          <w:i/>
-          <w:iCs/>
-          <w:noProof/>
-        </w:rPr>
-        <w:t xml:space="preserve"> </w:t>
-      </w:r>
-      <w:r>
-        <w:rPr>
-          <w:noProof/>
-        </w:rPr>
-        <w:t>Estos pasos se pueden replicar para descargar cualquiera de los tres repositorios.</w:t>
-      </w:r>
     </w:p>
     <w:p>
       <w:pPr>
@@ -1503,13 +2032,16 @@
       <w:r>
         <w:rPr>
           <w:noProof/>
+          <w:sz w:val="28"/>
+          <w:szCs w:val="28"/>
+          <w:vertAlign w:val="superscript"/>
         </w:rPr>
         <w:lastRenderedPageBreak/>
         <w:drawing>
-          <wp:inline distT="0" distB="0" distL="0" distR="0" wp14:anchorId="1B05FBF2" wp14:editId="3314011B">
-            <wp:extent cx="5612130" cy="2315845"/>
-            <wp:effectExtent l="19050" t="19050" r="26670" b="27305"/>
-            <wp:docPr id="2125225011" name="Imagen 6"/>
+          <wp:inline distT="0" distB="0" distL="0" distR="0" wp14:anchorId="1950E23C" wp14:editId="1D47BC50">
+            <wp:extent cx="5612130" cy="4118610"/>
+            <wp:effectExtent l="19050" t="19050" r="26670" b="15240"/>
+            <wp:docPr id="232008822" name="Imagen 7"/>
             <wp:cNvGraphicFramePr>
               <a:graphicFrameLocks xmlns:a="http://schemas.openxmlformats.org/drawingml/2006/main" noChangeAspect="1"/>
             </wp:cNvGraphicFramePr>
@@ -1517,442 +2049,7 @@
               <a:graphicData uri="http://schemas.openxmlformats.org/drawingml/2006/picture">
                 <pic:pic xmlns:pic="http://schemas.openxmlformats.org/drawingml/2006/picture">
                   <pic:nvPicPr>
-                    <pic:cNvPr id="2125225011" name="Imagen 2125225011"/>
-                    <pic:cNvPicPr/>
-                  </pic:nvPicPr>
-                  <pic:blipFill>
-                    <a:blip r:embed="rId13" cstate="print">
-                      <a:extLst>
-                        <a:ext uri="{28A0092B-C50C-407E-A947-70E740481C1C}">
-                          <a14:useLocalDpi xmlns:a14="http://schemas.microsoft.com/office/drawing/2010/main" val="0"/>
-                        </a:ext>
-                      </a:extLst>
-                    </a:blip>
-                    <a:stretch>
-                      <a:fillRect/>
-                    </a:stretch>
-                  </pic:blipFill>
-                  <pic:spPr>
-                    <a:xfrm>
-                      <a:off x="0" y="0"/>
-                      <a:ext cx="5612130" cy="2315845"/>
-                    </a:xfrm>
-                    <a:prstGeom prst="rect">
-                      <a:avLst/>
-                    </a:prstGeom>
-                    <a:ln w="6350">
-                      <a:solidFill>
-                        <a:schemeClr val="tx1"/>
-                      </a:solidFill>
-                    </a:ln>
-                  </pic:spPr>
-                </pic:pic>
-              </a:graphicData>
-            </a:graphic>
-          </wp:inline>
-        </w:drawing>
-      </w:r>
-      <w:r>
-        <w:rPr>
-          <w:noProof/>
-          <w:sz w:val="28"/>
-          <w:szCs w:val="28"/>
-          <w:vertAlign w:val="superscript"/>
-        </w:rPr>
-        <w:t xml:space="preserve">Imagen 6: repositorio </w:t>
-      </w:r>
-      <w:r>
-        <w:rPr>
-          <w:noProof/>
-          <w:sz w:val="28"/>
-          <w:szCs w:val="28"/>
-          <w:vertAlign w:val="superscript"/>
-        </w:rPr>
-        <w:t>de la organización repo-ssmc</w:t>
-      </w:r>
-      <w:r>
-        <w:rPr>
-          <w:noProof/>
-          <w:sz w:val="28"/>
-          <w:szCs w:val="28"/>
-          <w:vertAlign w:val="superscript"/>
-        </w:rPr>
-        <w:t>.</w:t>
-      </w:r>
-    </w:p>
-    <w:p>
-      <w:pPr>
-        <w:rPr>
-          <w:b/>
-          <w:bCs/>
-          <w:noProof/>
-          <w:sz w:val="28"/>
-          <w:szCs w:val="28"/>
-        </w:rPr>
-      </w:pPr>
-      <w:r>
-        <w:rPr>
-          <w:b/>
-          <w:bCs/>
-          <w:noProof/>
-          <w:sz w:val="28"/>
-          <w:szCs w:val="28"/>
-        </w:rPr>
-        <w:t xml:space="preserve">6.- </w:t>
-      </w:r>
-      <w:r>
-        <w:rPr>
-          <w:b/>
-          <w:bCs/>
-          <w:noProof/>
-          <w:sz w:val="28"/>
-          <w:szCs w:val="28"/>
-        </w:rPr>
-        <w:t>Descargar el repositorio</w:t>
-      </w:r>
-    </w:p>
-    <w:p>
-      <w:pPr>
-        <w:tabs>
-          <w:tab w:val="num" w:pos="720"/>
-        </w:tabs>
-        <w:rPr>
-          <w:noProof/>
-        </w:rPr>
-      </w:pPr>
-      <w:r>
-        <w:rPr>
-          <w:noProof/>
-        </w:rPr>
-        <w:t xml:space="preserve">En la página principal del repositorio </w:t>
-      </w:r>
-      <w:r>
-        <w:rPr>
-          <w:noProof/>
-        </w:rPr>
-        <w:t>“</w:t>
-      </w:r>
-      <w:r>
-        <w:rPr>
-          <w:i/>
-          <w:iCs/>
-          <w:noProof/>
-        </w:rPr>
-        <w:t>cambios-rem-app</w:t>
-      </w:r>
-      <w:r>
-        <w:rPr>
-          <w:i/>
-          <w:iCs/>
-          <w:noProof/>
-        </w:rPr>
-        <w:t>”</w:t>
-      </w:r>
-      <w:r>
-        <w:rPr>
-          <w:noProof/>
-        </w:rPr>
-        <w:t>, puede descargar el contenido como archivo ZIP</w:t>
-      </w:r>
-      <w:r>
-        <w:rPr>
-          <w:noProof/>
-        </w:rPr>
-        <w:t xml:space="preserve">, siga estos pasos, referencia </w:t>
-      </w:r>
-      <w:r>
-        <w:rPr>
-          <w:i/>
-          <w:iCs/>
-          <w:noProof/>
-        </w:rPr>
-        <w:t>“Imagen 7: descargar en formato zip”</w:t>
-      </w:r>
-      <w:r>
-        <w:rPr>
-          <w:noProof/>
-        </w:rPr>
-        <w:t>:</w:t>
-      </w:r>
-    </w:p>
-    <w:p>
-      <w:pPr>
-        <w:pStyle w:val="Prrafodelista"/>
-        <w:numPr>
-          <w:ilvl w:val="0"/>
-          <w:numId w:val="1"/>
-        </w:numPr>
-        <w:tabs>
-          <w:tab w:val="num" w:pos="720"/>
-        </w:tabs>
-        <w:rPr>
-          <w:noProof/>
-        </w:rPr>
-      </w:pPr>
-      <w:r>
-        <w:rPr>
-          <w:noProof/>
-        </w:rPr>
-        <w:t xml:space="preserve">Presione el botón </w:t>
-      </w:r>
-      <w:r>
-        <w:rPr>
-          <w:i/>
-          <w:iCs/>
-          <w:noProof/>
-        </w:rPr>
-        <w:t>“&lt;&gt; Code”.</w:t>
-      </w:r>
-    </w:p>
-    <w:p>
-      <w:pPr>
-        <w:pStyle w:val="Prrafodelista"/>
-        <w:numPr>
-          <w:ilvl w:val="0"/>
-          <w:numId w:val="1"/>
-        </w:numPr>
-        <w:rPr>
-          <w:noProof/>
-        </w:rPr>
-      </w:pPr>
-      <w:r>
-        <w:rPr>
-          <w:noProof/>
-        </w:rPr>
-        <w:t xml:space="preserve">Seleccione la opción </w:t>
-      </w:r>
-      <w:r>
-        <w:rPr>
-          <w:i/>
-          <w:iCs/>
-          <w:noProof/>
-        </w:rPr>
-        <w:t>“Download ZIP”.</w:t>
-      </w:r>
-    </w:p>
-    <w:p>
-      <w:pPr>
-        <w:rPr>
-          <w:noProof/>
-        </w:rPr>
-      </w:pPr>
-      <w:r>
-        <w:rPr>
-          <w:noProof/>
-        </w:rPr>
-        <w:t>La descarga se iniciará automáticamente.</w:t>
-      </w:r>
-    </w:p>
-    <w:p>
-      <w:pPr>
-        <w:rPr>
-          <w:i/>
-          <w:iCs/>
-          <w:noProof/>
-        </w:rPr>
-      </w:pPr>
-      <w:r>
-        <w:rPr>
-          <w:noProof/>
-        </w:rPr>
-        <w:t>Espere a que la descarga finalice. El archivo descargado aparecerá en su carpeta de descargas.</w:t>
-      </w:r>
-      <w:r>
-        <w:rPr>
-          <w:noProof/>
-        </w:rPr>
-        <w:t xml:space="preserve"> </w:t>
-      </w:r>
-      <w:r>
-        <w:rPr>
-          <w:i/>
-          <w:iCs/>
-          <w:noProof/>
-        </w:rPr>
-        <w:t>“</w:t>
-      </w:r>
-      <w:r>
-        <w:rPr>
-          <w:i/>
-          <w:iCs/>
-          <w:noProof/>
-        </w:rPr>
-        <w:t>Imagen</w:t>
-      </w:r>
-      <w:r>
-        <w:rPr>
-          <w:i/>
-          <w:iCs/>
-          <w:noProof/>
-        </w:rPr>
-        <w:t xml:space="preserve"> </w:t>
-      </w:r>
-      <w:r>
-        <w:rPr>
-          <w:i/>
-          <w:iCs/>
-          <w:noProof/>
-        </w:rPr>
-        <w:t>8: directorio de de</w:t>
-      </w:r>
-      <w:r>
-        <w:rPr>
-          <w:i/>
-          <w:iCs/>
-          <w:noProof/>
-        </w:rPr>
-        <w:t>s</w:t>
-      </w:r>
-      <w:r>
-        <w:rPr>
-          <w:i/>
-          <w:iCs/>
-          <w:noProof/>
-        </w:rPr>
-        <w:t>cargas”</w:t>
-      </w:r>
-      <w:r>
-        <w:rPr>
-          <w:i/>
-          <w:iCs/>
-          <w:noProof/>
-        </w:rPr>
-        <w:t>.</w:t>
-      </w:r>
-    </w:p>
-    <w:p>
-      <w:pPr>
-        <w:rPr>
-          <w:noProof/>
-        </w:rPr>
-      </w:pPr>
-    </w:p>
-    <w:p>
-      <w:pPr>
-        <w:jc w:val="center"/>
-        <w:rPr>
-          <w:noProof/>
-          <w:sz w:val="28"/>
-          <w:szCs w:val="28"/>
-          <w:vertAlign w:val="superscript"/>
-        </w:rPr>
-      </w:pPr>
-      <w:r>
-        <w:rPr>
-          <w:noProof/>
-        </w:rPr>
-        <w:lastRenderedPageBreak/>
-        <w:drawing>
-          <wp:inline distT="0" distB="0" distL="0" distR="0" wp14:anchorId="74181340" wp14:editId="0542D1D8">
-            <wp:extent cx="5612130" cy="2583815"/>
-            <wp:effectExtent l="19050" t="19050" r="26670" b="26035"/>
-            <wp:docPr id="1144723612" name="Imagen 8"/>
-            <wp:cNvGraphicFramePr>
-              <a:graphicFrameLocks xmlns:a="http://schemas.openxmlformats.org/drawingml/2006/main" noChangeAspect="1"/>
-            </wp:cNvGraphicFramePr>
-            <a:graphic xmlns:a="http://schemas.openxmlformats.org/drawingml/2006/main">
-              <a:graphicData uri="http://schemas.openxmlformats.org/drawingml/2006/picture">
-                <pic:pic xmlns:pic="http://schemas.openxmlformats.org/drawingml/2006/picture">
-                  <pic:nvPicPr>
-                    <pic:cNvPr id="1144723612" name="Imagen 1144723612"/>
-                    <pic:cNvPicPr/>
-                  </pic:nvPicPr>
-                  <pic:blipFill>
-                    <a:blip r:embed="rId14" cstate="print">
-                      <a:extLst>
-                        <a:ext uri="{28A0092B-C50C-407E-A947-70E740481C1C}">
-                          <a14:useLocalDpi xmlns:a14="http://schemas.microsoft.com/office/drawing/2010/main" val="0"/>
-                        </a:ext>
-                      </a:extLst>
-                    </a:blip>
-                    <a:stretch>
-                      <a:fillRect/>
-                    </a:stretch>
-                  </pic:blipFill>
-                  <pic:spPr>
-                    <a:xfrm>
-                      <a:off x="0" y="0"/>
-                      <a:ext cx="5612130" cy="2583815"/>
-                    </a:xfrm>
-                    <a:prstGeom prst="rect">
-                      <a:avLst/>
-                    </a:prstGeom>
-                    <a:ln w="6350">
-                      <a:solidFill>
-                        <a:schemeClr val="tx1"/>
-                      </a:solidFill>
-                    </a:ln>
-                  </pic:spPr>
-                </pic:pic>
-              </a:graphicData>
-            </a:graphic>
-          </wp:inline>
-        </w:drawing>
-      </w:r>
-      <w:r>
-        <w:rPr>
-          <w:noProof/>
-          <w:sz w:val="28"/>
-          <w:szCs w:val="28"/>
-          <w:vertAlign w:val="superscript"/>
-        </w:rPr>
-        <w:t>Imagen</w:t>
-      </w:r>
-      <w:r>
-        <w:rPr>
-          <w:noProof/>
-          <w:sz w:val="28"/>
-          <w:szCs w:val="28"/>
-          <w:vertAlign w:val="superscript"/>
-        </w:rPr>
-        <w:t xml:space="preserve"> 7: descargar en formato zip</w:t>
-      </w:r>
-      <w:r>
-        <w:rPr>
-          <w:noProof/>
-          <w:sz w:val="28"/>
-          <w:szCs w:val="28"/>
-          <w:vertAlign w:val="superscript"/>
-        </w:rPr>
-        <w:t>.</w:t>
-      </w:r>
-    </w:p>
-    <w:p>
-      <w:pPr>
-        <w:rPr>
-          <w:noProof/>
-        </w:rPr>
-      </w:pPr>
-    </w:p>
-    <w:p>
-      <w:pPr>
-        <w:jc w:val="center"/>
-        <w:rPr>
-          <w:i/>
-          <w:iCs/>
-          <w:noProof/>
-          <w:sz w:val="28"/>
-          <w:szCs w:val="28"/>
-          <w:vertAlign w:val="superscript"/>
-        </w:rPr>
-      </w:pPr>
-      <w:r>
-        <w:rPr>
-          <w:noProof/>
-        </w:rPr>
-        <w:drawing>
-          <wp:inline distT="0" distB="0" distL="0" distR="0" wp14:anchorId="757F11B7" wp14:editId="58A77D76">
-            <wp:extent cx="2450794" cy="723809"/>
-            <wp:effectExtent l="19050" t="19050" r="26035" b="19685"/>
-            <wp:docPr id="422495136" name="Imagen 12"/>
-            <wp:cNvGraphicFramePr>
-              <a:graphicFrameLocks xmlns:a="http://schemas.openxmlformats.org/drawingml/2006/main" noChangeAspect="1"/>
-            </wp:cNvGraphicFramePr>
-            <a:graphic xmlns:a="http://schemas.openxmlformats.org/drawingml/2006/main">
-              <a:graphicData uri="http://schemas.openxmlformats.org/drawingml/2006/picture">
-                <pic:pic xmlns:pic="http://schemas.openxmlformats.org/drawingml/2006/picture">
-                  <pic:nvPicPr>
-                    <pic:cNvPr id="422495136" name="Imagen 422495136"/>
+                    <pic:cNvPr id="232008822" name="Imagen 232008822"/>
                     <pic:cNvPicPr/>
                   </pic:nvPicPr>
                   <pic:blipFill>
@@ -1970,7 +2067,7 @@
                   <pic:spPr>
                     <a:xfrm>
                       <a:off x="0" y="0"/>
-                      <a:ext cx="2450794" cy="723809"/>
+                      <a:ext cx="5612130" cy="4118610"/>
                     </a:xfrm>
                     <a:prstGeom prst="rect">
                       <a:avLst/>
@@ -1987,34 +2084,41 @@
           </wp:inline>
         </w:drawing>
       </w:r>
-    </w:p>
-    <w:p>
-      <w:pPr>
-        <w:jc w:val="center"/>
-        <w:rPr>
-          <w:noProof/>
-          <w:sz w:val="28"/>
-          <w:szCs w:val="28"/>
-          <w:vertAlign w:val="superscript"/>
-        </w:rPr>
-      </w:pPr>
-      <w:r>
-        <w:rPr>
-          <w:noProof/>
-          <w:sz w:val="28"/>
-          <w:szCs w:val="28"/>
-          <w:vertAlign w:val="superscript"/>
-        </w:rPr>
-        <w:t>Imagen</w:t>
-      </w:r>
-      <w:r>
-        <w:rPr>
-          <w:noProof/>
-          <w:sz w:val="28"/>
-          <w:szCs w:val="28"/>
-          <w:vertAlign w:val="superscript"/>
-        </w:rPr>
-        <w:t xml:space="preserve"> 8: directorio de descargas</w:t>
+      <w:r>
+        <w:rPr>
+          <w:noProof/>
+          <w:sz w:val="28"/>
+          <w:szCs w:val="28"/>
+          <w:vertAlign w:val="superscript"/>
+        </w:rPr>
+        <w:t xml:space="preserve">Imagen </w:t>
+      </w:r>
+      <w:r>
+        <w:rPr>
+          <w:noProof/>
+          <w:sz w:val="28"/>
+          <w:szCs w:val="28"/>
+          <w:vertAlign w:val="superscript"/>
+        </w:rPr>
+        <w:t>8</w:t>
+      </w:r>
+      <w:r>
+        <w:rPr>
+          <w:noProof/>
+          <w:sz w:val="28"/>
+          <w:szCs w:val="28"/>
+          <w:vertAlign w:val="superscript"/>
+        </w:rPr>
+        <w:t xml:space="preserve">: repositorio </w:t>
+      </w:r>
+      <w:r>
+        <w:rPr>
+          <w:noProof/>
+          <w:sz w:val="28"/>
+          <w:szCs w:val="28"/>
+          <w:vertAlign w:val="superscript"/>
+        </w:rPr>
+        <w:t>de la organización repo-ssmc</w:t>
       </w:r>
       <w:r>
         <w:rPr>
@@ -2025,19 +2129,6 @@
         </w:rPr>
         <w:t>.</w:t>
       </w:r>
-    </w:p>
-    <w:p>
-      <w:pPr>
-        <w:jc w:val="center"/>
-        <w:rPr>
-          <w:i/>
-          <w:iCs/>
-          <w:noProof/>
-          <w:sz w:val="28"/>
-          <w:szCs w:val="28"/>
-          <w:vertAlign w:val="superscript"/>
-        </w:rPr>
-      </w:pPr>
     </w:p>
     <w:p>
       <w:pPr>
@@ -2057,7 +2148,7 @@
           <w:sz w:val="28"/>
           <w:szCs w:val="28"/>
         </w:rPr>
-        <w:t>7.</w:t>
+        <w:t>8</w:t>
       </w:r>
       <w:r>
         <w:rPr>
@@ -2067,9 +2158,429 @@
           <w:sz w:val="28"/>
           <w:szCs w:val="28"/>
         </w:rPr>
-        <w:t xml:space="preserve">- </w:t>
-      </w:r>
-      <w:r>
+        <w:t>.- Descargar el repositorio</w:t>
+      </w:r>
+    </w:p>
+    <w:p>
+      <w:pPr>
+        <w:tabs>
+          <w:tab w:val="num" w:pos="720"/>
+        </w:tabs>
+        <w:rPr>
+          <w:noProof/>
+        </w:rPr>
+      </w:pPr>
+      <w:r>
+        <w:rPr>
+          <w:noProof/>
+        </w:rPr>
+        <w:t xml:space="preserve">En la página principal del repositorio </w:t>
+      </w:r>
+      <w:r>
+        <w:rPr>
+          <w:noProof/>
+        </w:rPr>
+        <w:t>“</w:t>
+      </w:r>
+      <w:r>
+        <w:rPr>
+          <w:i/>
+          <w:iCs/>
+          <w:noProof/>
+        </w:rPr>
+        <w:t>cambios-rem-app</w:t>
+      </w:r>
+      <w:r>
+        <w:rPr>
+          <w:i/>
+          <w:iCs/>
+          <w:noProof/>
+        </w:rPr>
+        <w:t>”</w:t>
+      </w:r>
+      <w:r>
+        <w:rPr>
+          <w:noProof/>
+        </w:rPr>
+        <w:t xml:space="preserve">, </w:t>
+      </w:r>
+      <w:r>
+        <w:rPr>
+          <w:noProof/>
+        </w:rPr>
+        <w:t xml:space="preserve">acceda al menú lateral </w:t>
+      </w:r>
+      <w:r>
+        <w:rPr>
+          <w:i/>
+          <w:iCs/>
+          <w:noProof/>
+        </w:rPr>
+        <w:t>“Releases”</w:t>
+      </w:r>
+      <w:r>
+        <w:rPr>
+          <w:noProof/>
+        </w:rPr>
+        <w:t xml:space="preserve"> para descargar el contenido.</w:t>
+      </w:r>
+      <w:r>
+        <w:rPr>
+          <w:noProof/>
+        </w:rPr>
+        <w:br/>
+        <w:t xml:space="preserve">En este apartado encontrará la última versión del aplicativo. Seleccione </w:t>
+      </w:r>
+      <w:r>
+        <w:rPr>
+          <w:i/>
+          <w:iCs/>
+          <w:noProof/>
+        </w:rPr>
+        <w:t>“Cambios Ver 0.2 Latest”</w:t>
+      </w:r>
+      <w:r>
+        <w:rPr>
+          <w:noProof/>
+        </w:rPr>
+        <w:t>, lo que lo llevará a la sección del release más reciente</w:t>
+      </w:r>
+      <w:r>
+        <w:rPr>
+          <w:noProof/>
+        </w:rPr>
+        <w:t xml:space="preserve">, </w:t>
+      </w:r>
+      <w:r>
+        <w:rPr>
+          <w:i/>
+          <w:iCs/>
+          <w:noProof/>
+        </w:rPr>
+        <w:t>Imagen 9:</w:t>
+      </w:r>
+      <w:r>
+        <w:rPr>
+          <w:i/>
+          <w:iCs/>
+          <w:noProof/>
+        </w:rPr>
+        <w:t xml:space="preserve"> releases.</w:t>
+      </w:r>
+      <w:r>
+        <w:rPr>
+          <w:noProof/>
+        </w:rPr>
+        <w:br/>
+      </w:r>
+      <w:r>
+        <w:rPr>
+          <w:noProof/>
+        </w:rPr>
+        <w:t xml:space="preserve">Dentro del apartado </w:t>
+      </w:r>
+      <w:r>
+        <w:rPr>
+          <w:i/>
+          <w:iCs/>
+          <w:noProof/>
+        </w:rPr>
+        <w:t>“Assets”</w:t>
+      </w:r>
+      <w:r>
+        <w:rPr>
+          <w:noProof/>
+        </w:rPr>
+        <w:t xml:space="preserve">, haga clic en </w:t>
+      </w:r>
+      <w:r>
+        <w:rPr>
+          <w:i/>
+          <w:iCs/>
+          <w:noProof/>
+        </w:rPr>
+        <w:t>“cambios-rem-app.rar”</w:t>
+      </w:r>
+      <w:r>
+        <w:rPr>
+          <w:i/>
+          <w:iCs/>
+          <w:noProof/>
+        </w:rPr>
+        <w:t>.</w:t>
+      </w:r>
+      <w:r>
+        <w:rPr>
+          <w:noProof/>
+        </w:rPr>
+        <w:t xml:space="preserve"> </w:t>
+      </w:r>
+      <w:r>
+        <w:rPr>
+          <w:i/>
+          <w:iCs/>
+          <w:noProof/>
+        </w:rPr>
+        <w:t>Imagen 10: Assets release latest</w:t>
+      </w:r>
+      <w:r>
+        <w:rPr>
+          <w:noProof/>
+        </w:rPr>
+        <w:t>. La descarga se iniciará automáticamente.</w:t>
+      </w:r>
+    </w:p>
+    <w:p>
+      <w:pPr>
+        <w:jc w:val="center"/>
+        <w:rPr>
+          <w:noProof/>
+          <w:sz w:val="28"/>
+          <w:szCs w:val="28"/>
+          <w:vertAlign w:val="superscript"/>
+        </w:rPr>
+      </w:pPr>
+      <w:r>
+        <w:rPr>
+          <w:noProof/>
+          <w:sz w:val="28"/>
+          <w:szCs w:val="28"/>
+          <w:vertAlign w:val="superscript"/>
+        </w:rPr>
+        <w:lastRenderedPageBreak/>
+        <w:drawing>
+          <wp:inline distT="0" distB="0" distL="0" distR="0" wp14:anchorId="4A28F1EE" wp14:editId="2F1083F7">
+            <wp:extent cx="5612130" cy="4686935"/>
+            <wp:effectExtent l="19050" t="19050" r="26670" b="18415"/>
+            <wp:docPr id="1991860739" name="Imagen 8"/>
+            <wp:cNvGraphicFramePr>
+              <a:graphicFrameLocks xmlns:a="http://schemas.openxmlformats.org/drawingml/2006/main" noChangeAspect="1"/>
+            </wp:cNvGraphicFramePr>
+            <a:graphic xmlns:a="http://schemas.openxmlformats.org/drawingml/2006/main">
+              <a:graphicData uri="http://schemas.openxmlformats.org/drawingml/2006/picture">
+                <pic:pic xmlns:pic="http://schemas.openxmlformats.org/drawingml/2006/picture">
+                  <pic:nvPicPr>
+                    <pic:cNvPr id="1991860739" name="Imagen 1991860739"/>
+                    <pic:cNvPicPr/>
+                  </pic:nvPicPr>
+                  <pic:blipFill>
+                    <a:blip r:embed="rId16">
+                      <a:extLst>
+                        <a:ext uri="{28A0092B-C50C-407E-A947-70E740481C1C}">
+                          <a14:useLocalDpi xmlns:a14="http://schemas.microsoft.com/office/drawing/2010/main" val="0"/>
+                        </a:ext>
+                      </a:extLst>
+                    </a:blip>
+                    <a:stretch>
+                      <a:fillRect/>
+                    </a:stretch>
+                  </pic:blipFill>
+                  <pic:spPr>
+                    <a:xfrm>
+                      <a:off x="0" y="0"/>
+                      <a:ext cx="5612130" cy="4686935"/>
+                    </a:xfrm>
+                    <a:prstGeom prst="rect">
+                      <a:avLst/>
+                    </a:prstGeom>
+                    <a:ln w="6350">
+                      <a:solidFill>
+                        <a:schemeClr val="tx1"/>
+                      </a:solidFill>
+                    </a:ln>
+                  </pic:spPr>
+                </pic:pic>
+              </a:graphicData>
+            </a:graphic>
+          </wp:inline>
+        </w:drawing>
+      </w:r>
+      <w:r>
+        <w:rPr>
+          <w:noProof/>
+          <w:sz w:val="28"/>
+          <w:szCs w:val="28"/>
+          <w:vertAlign w:val="superscript"/>
+        </w:rPr>
+        <w:t>Imagen</w:t>
+      </w:r>
+      <w:r>
+        <w:rPr>
+          <w:noProof/>
+          <w:sz w:val="28"/>
+          <w:szCs w:val="28"/>
+          <w:vertAlign w:val="superscript"/>
+        </w:rPr>
+        <w:t xml:space="preserve"> </w:t>
+      </w:r>
+      <w:r>
+        <w:rPr>
+          <w:noProof/>
+          <w:sz w:val="28"/>
+          <w:szCs w:val="28"/>
+          <w:vertAlign w:val="superscript"/>
+        </w:rPr>
+        <w:t>9</w:t>
+      </w:r>
+      <w:r>
+        <w:rPr>
+          <w:noProof/>
+          <w:sz w:val="28"/>
+          <w:szCs w:val="28"/>
+          <w:vertAlign w:val="superscript"/>
+        </w:rPr>
+        <w:t xml:space="preserve">: </w:t>
+      </w:r>
+      <w:r>
+        <w:rPr>
+          <w:noProof/>
+          <w:sz w:val="28"/>
+          <w:szCs w:val="28"/>
+          <w:vertAlign w:val="superscript"/>
+        </w:rPr>
+        <w:t>Menú Releases</w:t>
+      </w:r>
+      <w:r>
+        <w:rPr>
+          <w:noProof/>
+          <w:sz w:val="28"/>
+          <w:szCs w:val="28"/>
+          <w:vertAlign w:val="superscript"/>
+        </w:rPr>
+        <w:t>.</w:t>
+      </w:r>
+    </w:p>
+    <w:p>
+      <w:pPr>
+        <w:jc w:val="center"/>
+        <w:rPr>
+          <w:noProof/>
+        </w:rPr>
+      </w:pPr>
+      <w:r>
+        <w:rPr>
+          <w:noProof/>
+        </w:rPr>
+        <w:lastRenderedPageBreak/>
+        <w:drawing>
+          <wp:inline distT="0" distB="0" distL="0" distR="0" wp14:anchorId="3171133B" wp14:editId="7622B19B">
+            <wp:extent cx="5612130" cy="3188970"/>
+            <wp:effectExtent l="19050" t="19050" r="26670" b="11430"/>
+            <wp:docPr id="1293331592" name="Imagen 10"/>
+            <wp:cNvGraphicFramePr>
+              <a:graphicFrameLocks xmlns:a="http://schemas.openxmlformats.org/drawingml/2006/main" noChangeAspect="1"/>
+            </wp:cNvGraphicFramePr>
+            <a:graphic xmlns:a="http://schemas.openxmlformats.org/drawingml/2006/main">
+              <a:graphicData uri="http://schemas.openxmlformats.org/drawingml/2006/picture">
+                <pic:pic xmlns:pic="http://schemas.openxmlformats.org/drawingml/2006/picture">
+                  <pic:nvPicPr>
+                    <pic:cNvPr id="1293331592" name="Imagen 1293331592"/>
+                    <pic:cNvPicPr/>
+                  </pic:nvPicPr>
+                  <pic:blipFill>
+                    <a:blip r:embed="rId17">
+                      <a:extLst>
+                        <a:ext uri="{28A0092B-C50C-407E-A947-70E740481C1C}">
+                          <a14:useLocalDpi xmlns:a14="http://schemas.microsoft.com/office/drawing/2010/main" val="0"/>
+                        </a:ext>
+                      </a:extLst>
+                    </a:blip>
+                    <a:stretch>
+                      <a:fillRect/>
+                    </a:stretch>
+                  </pic:blipFill>
+                  <pic:spPr>
+                    <a:xfrm>
+                      <a:off x="0" y="0"/>
+                      <a:ext cx="5612130" cy="3188970"/>
+                    </a:xfrm>
+                    <a:prstGeom prst="rect">
+                      <a:avLst/>
+                    </a:prstGeom>
+                    <a:ln w="6350">
+                      <a:solidFill>
+                        <a:schemeClr val="tx1"/>
+                      </a:solidFill>
+                    </a:ln>
+                  </pic:spPr>
+                </pic:pic>
+              </a:graphicData>
+            </a:graphic>
+          </wp:inline>
+        </w:drawing>
+      </w:r>
+    </w:p>
+    <w:p>
+      <w:pPr>
+        <w:jc w:val="center"/>
+        <w:rPr>
+          <w:noProof/>
+          <w:sz w:val="28"/>
+          <w:szCs w:val="28"/>
+          <w:vertAlign w:val="superscript"/>
+        </w:rPr>
+      </w:pPr>
+      <w:r>
+        <w:rPr>
+          <w:noProof/>
+          <w:sz w:val="28"/>
+          <w:szCs w:val="28"/>
+          <w:vertAlign w:val="superscript"/>
+        </w:rPr>
+        <w:t>Imagen</w:t>
+      </w:r>
+      <w:r>
+        <w:rPr>
+          <w:noProof/>
+          <w:sz w:val="28"/>
+          <w:szCs w:val="28"/>
+          <w:vertAlign w:val="superscript"/>
+        </w:rPr>
+        <w:t xml:space="preserve"> </w:t>
+      </w:r>
+      <w:r>
+        <w:rPr>
+          <w:noProof/>
+          <w:sz w:val="28"/>
+          <w:szCs w:val="28"/>
+          <w:vertAlign w:val="superscript"/>
+        </w:rPr>
+        <w:t>10</w:t>
+      </w:r>
+      <w:r>
+        <w:rPr>
+          <w:noProof/>
+          <w:sz w:val="28"/>
+          <w:szCs w:val="28"/>
+          <w:vertAlign w:val="superscript"/>
+        </w:rPr>
+        <w:t>: directorio de descargas</w:t>
+      </w:r>
+      <w:r>
+        <w:rPr>
+          <w:noProof/>
+          <w:sz w:val="28"/>
+          <w:szCs w:val="28"/>
+          <w:vertAlign w:val="superscript"/>
+        </w:rPr>
+        <w:t>.</w:t>
+      </w:r>
+    </w:p>
+    <w:p>
+      <w:pPr>
+        <w:jc w:val="center"/>
+        <w:rPr>
+          <w:i/>
+          <w:iCs/>
+          <w:noProof/>
+          <w:sz w:val="28"/>
+          <w:szCs w:val="28"/>
+          <w:vertAlign w:val="superscript"/>
+        </w:rPr>
+      </w:pPr>
+    </w:p>
+    <w:p>
+      <w:pPr>
         <w:rPr>
           <w:b/>
           <w:bCs/>
@@ -2077,7 +2588,26 @@
           <w:sz w:val="28"/>
           <w:szCs w:val="28"/>
         </w:rPr>
-        <w:t>Descomprimir el archivo descargado</w:t>
+      </w:pPr>
+      <w:r>
+        <w:rPr>
+          <w:b/>
+          <w:bCs/>
+          <w:noProof/>
+          <w:sz w:val="28"/>
+          <w:szCs w:val="28"/>
+        </w:rPr>
+        <w:t>9</w:t>
+      </w:r>
+      <w:r>
+        <w:rPr>
+          <w:b/>
+          <w:bCs/>
+          <w:noProof/>
+          <w:sz w:val="28"/>
+          <w:szCs w:val="28"/>
+        </w:rPr>
+        <w:t>.- Descomprimir el archivo descargado</w:t>
       </w:r>
     </w:p>
     <w:p>
@@ -2098,7 +2628,7 @@
         </w:rPr>
         <w:t xml:space="preserve"> </w:t>
       </w:r>
-      <w:hyperlink r:id="rId16" w:history="1">
+      <w:hyperlink r:id="rId18" w:history="1">
         <w:r>
           <w:rPr>
             <w:rStyle w:val="Hipervnculo"/>
@@ -2221,7 +2751,23 @@
           <w:iCs/>
           <w:noProof/>
         </w:rPr>
-        <w:t xml:space="preserve">“Imagen 9: </w:t>
+        <w:t xml:space="preserve">Imagen </w:t>
+      </w:r>
+      <w:r>
+        <w:rPr>
+          <w:i/>
+          <w:iCs/>
+          <w:noProof/>
+        </w:rPr>
+        <w:t>11</w:t>
+      </w:r>
+      <w:r>
+        <w:rPr>
+          <w:i/>
+          <w:iCs/>
+          <w:noProof/>
+        </w:rPr>
+        <w:t xml:space="preserve">: </w:t>
       </w:r>
       <w:r>
         <w:rPr>
@@ -2253,7 +2799,7 @@
           <w:iCs/>
           <w:noProof/>
         </w:rPr>
-        <w:t>xtarer aquí”</w:t>
+        <w:t>xtarer aquí</w:t>
       </w:r>
       <w:r>
         <w:rPr>
@@ -2274,7 +2820,86 @@
         <w:rPr>
           <w:noProof/>
         </w:rPr>
-        <w:t>Esto generará una carpeta llamada</w:t>
+        <w:t xml:space="preserve">Esto generará una carpeta llamada </w:t>
+      </w:r>
+      <w:r>
+        <w:rPr>
+          <w:noProof/>
+        </w:rPr>
+        <w:t xml:space="preserve">“cambios-rem-app-main” </w:t>
+      </w:r>
+      <w:r>
+        <w:rPr>
+          <w:noProof/>
+        </w:rPr>
+        <w:t>con la estructura completa del proyecto</w:t>
+      </w:r>
+      <w:r>
+        <w:rPr>
+          <w:noProof/>
+        </w:rPr>
+        <w:t xml:space="preserve">, </w:t>
+      </w:r>
+      <w:r>
+        <w:rPr>
+          <w:i/>
+          <w:iCs/>
+          <w:noProof/>
+        </w:rPr>
+        <w:t xml:space="preserve">Imagen </w:t>
+      </w:r>
+      <w:r>
+        <w:rPr>
+          <w:i/>
+          <w:iCs/>
+          <w:noProof/>
+        </w:rPr>
+        <w:t>1</w:t>
+      </w:r>
+      <w:r>
+        <w:rPr>
+          <w:i/>
+          <w:iCs/>
+          <w:noProof/>
+        </w:rPr>
+        <w:t>2</w:t>
+      </w:r>
+      <w:r>
+        <w:rPr>
+          <w:i/>
+          <w:iCs/>
+          <w:noProof/>
+        </w:rPr>
+        <w:t xml:space="preserve">: </w:t>
+      </w:r>
+      <w:r>
+        <w:rPr>
+          <w:i/>
+          <w:iCs/>
+          <w:noProof/>
+        </w:rPr>
+        <w:t>directorio extraído.</w:t>
+      </w:r>
+    </w:p>
+    <w:p>
+      <w:pPr>
+        <w:rPr>
+          <w:noProof/>
+        </w:rPr>
+      </w:pPr>
+      <w:r>
+        <w:rPr>
+          <w:noProof/>
+        </w:rPr>
+        <w:t xml:space="preserve">Nota: al archivo </w:t>
+      </w:r>
+      <w:r>
+        <w:rPr>
+          <w:i/>
+          <w:iCs/>
+          <w:noProof/>
+        </w:rPr>
+        <w:t>“README.md”</w:t>
       </w:r>
       <w:r>
         <w:rPr>
@@ -2286,126 +2911,33 @@
         <w:rPr>
           <w:noProof/>
         </w:rPr>
-        <w:t xml:space="preserve">“cambios-rem-app-main” </w:t>
-      </w:r>
-      <w:r>
-        <w:rPr>
-          <w:noProof/>
-        </w:rPr>
-        <w:t>con la estructura completa del proyecto</w:t>
-      </w:r>
-      <w:r>
-        <w:rPr>
-          <w:noProof/>
-        </w:rPr>
-        <w:t xml:space="preserve">, </w:t>
-      </w:r>
-      <w:r>
-        <w:rPr>
-          <w:i/>
-          <w:iCs/>
-          <w:noProof/>
-        </w:rPr>
-        <w:t xml:space="preserve">“Imagen </w:t>
-      </w:r>
-      <w:r>
-        <w:rPr>
-          <w:i/>
-          <w:iCs/>
-          <w:noProof/>
-        </w:rPr>
-        <w:t>10</w:t>
-      </w:r>
-      <w:r>
-        <w:rPr>
-          <w:i/>
-          <w:iCs/>
-          <w:noProof/>
-        </w:rPr>
-        <w:t xml:space="preserve">: </w:t>
-      </w:r>
-      <w:r>
-        <w:rPr>
-          <w:i/>
-          <w:iCs/>
-          <w:noProof/>
-        </w:rPr>
-        <w:t>directorio extraído</w:t>
-      </w:r>
-      <w:r>
-        <w:rPr>
-          <w:i/>
-          <w:iCs/>
-          <w:noProof/>
-        </w:rPr>
-        <w:t>”</w:t>
-      </w:r>
-      <w:r>
-        <w:rPr>
-          <w:i/>
-          <w:iCs/>
-          <w:noProof/>
-        </w:rPr>
-        <w:t>.</w:t>
-      </w:r>
-    </w:p>
-    <w:p>
-      <w:pPr>
-        <w:rPr>
-          <w:noProof/>
-        </w:rPr>
-      </w:pPr>
-      <w:r>
-        <w:rPr>
+        <w:t>es únicamente informativo y no afecta la ejecución del aplicativo. Puede eliminarlo si lo desea.</w:t>
+      </w:r>
+    </w:p>
+    <w:p>
+      <w:pPr>
+        <w:rPr>
+          <w:noProof/>
+        </w:rPr>
+      </w:pPr>
+    </w:p>
+    <w:p>
+      <w:pPr>
+        <w:jc w:val="center"/>
+        <w:rPr>
+          <w:noProof/>
+          <w:sz w:val="28"/>
+          <w:szCs w:val="28"/>
+          <w:vertAlign w:val="superscript"/>
+        </w:rPr>
+      </w:pPr>
+      <w:r>
+        <w:rPr>
+          <w:i/>
+          <w:iCs/>
           <w:noProof/>
         </w:rPr>
         <w:lastRenderedPageBreak/>
-        <w:t xml:space="preserve">Nota: al archivo </w:t>
-      </w:r>
-      <w:r>
-        <w:rPr>
-          <w:i/>
-          <w:iCs/>
-          <w:noProof/>
-        </w:rPr>
-        <w:t>“README.md”</w:t>
-      </w:r>
-      <w:r>
-        <w:rPr>
-          <w:noProof/>
-        </w:rPr>
-        <w:t xml:space="preserve"> </w:t>
-      </w:r>
-      <w:r>
-        <w:rPr>
-          <w:noProof/>
-        </w:rPr>
-        <w:t>es únicamente informativo y no afecta la ejecución del aplicativo. Puede eliminarlo si lo desea.</w:t>
-      </w:r>
-    </w:p>
-    <w:p>
-      <w:pPr>
-        <w:rPr>
-          <w:noProof/>
-        </w:rPr>
-      </w:pPr>
-    </w:p>
-    <w:p>
-      <w:pPr>
-        <w:jc w:val="center"/>
-        <w:rPr>
-          <w:noProof/>
-          <w:sz w:val="28"/>
-          <w:szCs w:val="28"/>
-          <w:vertAlign w:val="superscript"/>
-        </w:rPr>
-      </w:pPr>
-      <w:r>
-        <w:rPr>
-          <w:i/>
-          <w:iCs/>
-          <w:noProof/>
-        </w:rPr>
         <w:drawing>
           <wp:inline distT="0" distB="0" distL="0" distR="0" wp14:anchorId="19BC6306" wp14:editId="18D5F102">
             <wp:extent cx="5612130" cy="3120390"/>
@@ -2422,7 +2954,7 @@
                     <pic:cNvPicPr/>
                   </pic:nvPicPr>
                   <pic:blipFill>
-                    <a:blip r:embed="rId17">
+                    <a:blip r:embed="rId19">
                       <a:extLst>
                         <a:ext uri="{28A0092B-C50C-407E-A947-70E740481C1C}">
                           <a14:useLocalDpi xmlns:a14="http://schemas.microsoft.com/office/drawing/2010/main" val="0"/>
@@ -2460,7 +2992,25 @@
           <w:szCs w:val="28"/>
           <w:vertAlign w:val="superscript"/>
         </w:rPr>
-        <w:t>Imagen 9: Win</w:t>
+        <w:t xml:space="preserve">Imagen </w:t>
+      </w:r>
+      <w:r>
+        <w:rPr>
+          <w:noProof/>
+          <w:sz w:val="28"/>
+          <w:szCs w:val="28"/>
+          <w:vertAlign w:val="superscript"/>
+        </w:rPr>
+        <w:t>11</w:t>
+      </w:r>
+      <w:r>
+        <w:rPr>
+          <w:noProof/>
+          <w:sz w:val="28"/>
+          <w:szCs w:val="28"/>
+          <w:vertAlign w:val="superscript"/>
+        </w:rPr>
+        <w:t>: Win</w:t>
       </w:r>
       <w:r>
         <w:rPr>
@@ -2512,10 +3062,10 @@
           <w:noProof/>
         </w:rPr>
         <w:drawing>
-          <wp:inline distT="0" distB="0" distL="0" distR="0" wp14:anchorId="0B472E23" wp14:editId="3AD34EBA">
-            <wp:extent cx="2120635" cy="1866667"/>
-            <wp:effectExtent l="19050" t="19050" r="13335" b="19685"/>
-            <wp:docPr id="253632647" name="Imagen 11"/>
+          <wp:inline distT="0" distB="0" distL="0" distR="0" wp14:anchorId="591A530C" wp14:editId="7E722B3B">
+            <wp:extent cx="2120635" cy="1434921"/>
+            <wp:effectExtent l="19050" t="19050" r="13335" b="13335"/>
+            <wp:docPr id="1740247886" name="Imagen 12"/>
             <wp:cNvGraphicFramePr>
               <a:graphicFrameLocks xmlns:a="http://schemas.openxmlformats.org/drawingml/2006/main" noChangeAspect="1"/>
             </wp:cNvGraphicFramePr>
@@ -2523,11 +3073,11 @@
               <a:graphicData uri="http://schemas.openxmlformats.org/drawingml/2006/picture">
                 <pic:pic xmlns:pic="http://schemas.openxmlformats.org/drawingml/2006/picture">
                   <pic:nvPicPr>
-                    <pic:cNvPr id="253632647" name="Imagen 253632647"/>
+                    <pic:cNvPr id="1740247886" name="Imagen 1740247886"/>
                     <pic:cNvPicPr/>
                   </pic:nvPicPr>
                   <pic:blipFill>
-                    <a:blip r:embed="rId18">
+                    <a:blip r:embed="rId20">
                       <a:extLst>
                         <a:ext uri="{28A0092B-C50C-407E-A947-70E740481C1C}">
                           <a14:useLocalDpi xmlns:a14="http://schemas.microsoft.com/office/drawing/2010/main" val="0"/>
@@ -2541,7 +3091,7 @@
                   <pic:spPr>
                     <a:xfrm>
                       <a:off x="0" y="0"/>
-                      <a:ext cx="2120635" cy="1866667"/>
+                      <a:ext cx="2120635" cy="1434921"/>
                     </a:xfrm>
                     <a:prstGeom prst="rect">
                       <a:avLst/>
@@ -2584,7 +3134,16 @@
           <w:szCs w:val="28"/>
           <w:vertAlign w:val="superscript"/>
         </w:rPr>
-        <w:t>10</w:t>
+        <w:t>1</w:t>
+      </w:r>
+      <w:r>
+        <w:rPr>
+          <w:noProof/>
+          <w:sz w:val="28"/>
+          <w:szCs w:val="28"/>
+          <w:vertAlign w:val="superscript"/>
+        </w:rPr>
+        <w:t>2</w:t>
       </w:r>
       <w:r>
         <w:rPr>
@@ -2623,8 +3182,8 @@
       </w:r>
     </w:p>
     <w:sectPr>
-      <w:headerReference w:type="default" r:id="rId19"/>
-      <w:footerReference w:type="default" r:id="rId20"/>
+      <w:headerReference w:type="default" r:id="rId21"/>
+      <w:footerReference w:type="default" r:id="rId22"/>
       <w:pgSz w:w="12240" w:h="15840"/>
       <w:pgMar w:top="1417" w:right="1701" w:bottom="1417" w:left="1701" w:header="708" w:footer="708" w:gutter="0"/>
       <w:pgNumType w:start="0"/>

</xml_diff>

<commit_message>
Modificación según apreciaciones de presentación vía streaming
</commit_message>
<xml_diff>
--- a/manual-de-descarga-repositorio-github.docx
+++ b/manual-de-descarga-repositorio-github.docx
@@ -3411,9 +3411,266 @@
         <w:t xml:space="preserve"> extraído.</w:t>
       </w:r>
     </w:p>
+    <w:p>
+      <w:pPr>
+        <w:rPr>
+          <w:b/>
+          <w:bCs/>
+          <w:noProof/>
+          <w:sz w:val="28"/>
+          <w:szCs w:val="28"/>
+        </w:rPr>
+      </w:pPr>
+    </w:p>
+    <w:p>
+      <w:pPr>
+        <w:rPr>
+          <w:b/>
+          <w:bCs/>
+          <w:noProof/>
+          <w:sz w:val="28"/>
+          <w:szCs w:val="28"/>
+        </w:rPr>
+      </w:pPr>
+      <w:r>
+        <w:rPr>
+          <w:b/>
+          <w:bCs/>
+          <w:noProof/>
+          <w:sz w:val="28"/>
+          <w:szCs w:val="28"/>
+        </w:rPr>
+        <w:t>10</w:t>
+      </w:r>
+      <w:r>
+        <w:rPr>
+          <w:b/>
+          <w:bCs/>
+          <w:noProof/>
+          <w:sz w:val="28"/>
+          <w:szCs w:val="28"/>
+        </w:rPr>
+        <w:t xml:space="preserve">.- </w:t>
+      </w:r>
+      <w:r>
+        <w:rPr>
+          <w:b/>
+          <w:bCs/>
+          <w:noProof/>
+          <w:sz w:val="28"/>
+          <w:szCs w:val="28"/>
+        </w:rPr>
+        <w:t>Eliminar documento serie de muestra</w:t>
+      </w:r>
+    </w:p>
+    <w:p>
+      <w:pPr>
+        <w:rPr>
+          <w:noProof/>
+        </w:rPr>
+      </w:pPr>
+      <w:r>
+        <w:rPr>
+          <w:noProof/>
+        </w:rPr>
+        <w:lastRenderedPageBreak/>
+        <w:t>Como último paso luego de la descarga solo queda eliminar la serie “</w:t>
+      </w:r>
+      <w:r>
+        <w:rPr>
+          <w:noProof/>
+        </w:rPr>
+        <w:t>111100A09V1.xlsm</w:t>
+      </w:r>
+      <w:r>
+        <w:rPr>
+          <w:noProof/>
+        </w:rPr>
+        <w:t xml:space="preserve">” </w:t>
+      </w:r>
+      <w:r>
+        <w:rPr>
+          <w:noProof/>
+        </w:rPr>
+        <w:t>d</w:t>
+      </w:r>
+      <w:r>
+        <w:rPr>
+          <w:noProof/>
+        </w:rPr>
+        <w:t>el directorio “rem”</w:t>
+      </w:r>
+      <w:r>
+        <w:rPr>
+          <w:noProof/>
+        </w:rPr>
+        <w:t>,</w:t>
+      </w:r>
+      <w:r>
+        <w:rPr>
+          <w:noProof/>
+        </w:rPr>
+        <w:t xml:space="preserve"> </w:t>
+      </w:r>
+      <w:r>
+        <w:rPr>
+          <w:i/>
+          <w:iCs/>
+          <w:noProof/>
+        </w:rPr>
+        <w:t>Imagen 14: Eliminar serie</w:t>
+      </w:r>
+      <w:r>
+        <w:rPr>
+          <w:noProof/>
+        </w:rPr>
+        <w:t>. E</w:t>
+      </w:r>
+      <w:r>
+        <w:rPr>
+          <w:noProof/>
+        </w:rPr>
+        <w:t xml:space="preserve">ste documento es solo de muestra, </w:t>
+      </w:r>
+      <w:r>
+        <w:rPr>
+          <w:noProof/>
+        </w:rPr>
+        <w:t xml:space="preserve">el motivo por el cual </w:t>
+      </w:r>
+      <w:r>
+        <w:rPr>
+          <w:noProof/>
+        </w:rPr>
+        <w:t>se agre</w:t>
+      </w:r>
+      <w:r>
+        <w:rPr>
+          <w:noProof/>
+        </w:rPr>
+        <w:t xml:space="preserve">gó al repositorio es que la plataforma GitHub solo reconoce un directorio cuando en su interior existe un elemento. </w:t>
+      </w:r>
+    </w:p>
+    <w:p>
+      <w:pPr>
+        <w:rPr>
+          <w:noProof/>
+        </w:rPr>
+      </w:pPr>
+    </w:p>
+    <w:p>
+      <w:pPr>
+        <w:jc w:val="center"/>
+        <w:rPr>
+          <w:noProof/>
+          <w:sz w:val="28"/>
+          <w:szCs w:val="28"/>
+          <w:vertAlign w:val="superscript"/>
+        </w:rPr>
+      </w:pPr>
+      <w:r>
+        <w:rPr>
+          <w:noProof/>
+        </w:rPr>
+        <w:drawing>
+          <wp:inline distT="0" distB="0" distL="0" distR="0" wp14:anchorId="2F6FBC22" wp14:editId="61426C0C">
+            <wp:extent cx="2236498" cy="1728203"/>
+            <wp:effectExtent l="19050" t="19050" r="11430" b="24765"/>
+            <wp:docPr id="1651264655" name="Imagen 2"/>
+            <wp:cNvGraphicFramePr>
+              <a:graphicFrameLocks xmlns:a="http://schemas.openxmlformats.org/drawingml/2006/main" noChangeAspect="1"/>
+            </wp:cNvGraphicFramePr>
+            <a:graphic xmlns:a="http://schemas.openxmlformats.org/drawingml/2006/main">
+              <a:graphicData uri="http://schemas.openxmlformats.org/drawingml/2006/picture">
+                <pic:pic xmlns:pic="http://schemas.openxmlformats.org/drawingml/2006/picture">
+                  <pic:nvPicPr>
+                    <pic:cNvPr id="1651264655" name="Imagen 1651264655"/>
+                    <pic:cNvPicPr/>
+                  </pic:nvPicPr>
+                  <pic:blipFill>
+                    <a:blip r:embed="rId22">
+                      <a:extLst>
+                        <a:ext uri="{28A0092B-C50C-407E-A947-70E740481C1C}">
+                          <a14:useLocalDpi xmlns:a14="http://schemas.microsoft.com/office/drawing/2010/main" val="0"/>
+                        </a:ext>
+                      </a:extLst>
+                    </a:blip>
+                    <a:stretch>
+                      <a:fillRect/>
+                    </a:stretch>
+                  </pic:blipFill>
+                  <pic:spPr>
+                    <a:xfrm>
+                      <a:off x="0" y="0"/>
+                      <a:ext cx="2236498" cy="1728203"/>
+                    </a:xfrm>
+                    <a:prstGeom prst="rect">
+                      <a:avLst/>
+                    </a:prstGeom>
+                    <a:ln w="6350">
+                      <a:solidFill>
+                        <a:schemeClr val="tx1"/>
+                      </a:solidFill>
+                    </a:ln>
+                  </pic:spPr>
+                </pic:pic>
+              </a:graphicData>
+            </a:graphic>
+          </wp:inline>
+        </w:drawing>
+      </w:r>
+    </w:p>
+    <w:p>
+      <w:pPr>
+        <w:jc w:val="center"/>
+        <w:rPr>
+          <w:noProof/>
+          <w:sz w:val="28"/>
+          <w:szCs w:val="28"/>
+          <w:vertAlign w:val="superscript"/>
+        </w:rPr>
+      </w:pPr>
+      <w:r>
+        <w:rPr>
+          <w:noProof/>
+          <w:sz w:val="28"/>
+          <w:szCs w:val="28"/>
+          <w:vertAlign w:val="superscript"/>
+        </w:rPr>
+        <w:t>Imagen 14: Eliminar serie</w:t>
+      </w:r>
+    </w:p>
+    <w:p>
+      <w:pPr>
+        <w:rPr>
+          <w:b/>
+          <w:bCs/>
+          <w:noProof/>
+          <w:sz w:val="28"/>
+          <w:szCs w:val="28"/>
+        </w:rPr>
+      </w:pPr>
+    </w:p>
+    <w:p>
+      <w:pPr>
+        <w:rPr>
+          <w:noProof/>
+          <w:sz w:val="28"/>
+          <w:szCs w:val="28"/>
+          <w:vertAlign w:val="superscript"/>
+        </w:rPr>
+      </w:pPr>
+      <w:r>
+        <w:rPr>
+          <w:sz w:val="28"/>
+          <w:szCs w:val="28"/>
+        </w:rPr>
+        <w:t xml:space="preserve"> </w:t>
+      </w:r>
+    </w:p>
     <w:sectPr>
-      <w:headerReference w:type="default" r:id="rId22"/>
-      <w:footerReference w:type="default" r:id="rId23"/>
+      <w:headerReference w:type="default" r:id="rId23"/>
+      <w:footerReference w:type="default" r:id="rId24"/>
       <w:pgSz w:w="12240" w:h="15840"/>
       <w:pgMar w:top="1417" w:right="1701" w:bottom="1417" w:left="1701" w:header="708" w:footer="708" w:gutter="0"/>
       <w:pgNumType w:start="0"/>

</xml_diff>